<commit_message>
Update Project Plan - Campus Rental.docx
</commit_message>
<xml_diff>
--- a/docs/Project Plan - Campus Rental.docx
+++ b/docs/Project Plan - Campus Rental.docx
@@ -34,12 +34,12 @@
     </w:p>
     <w:p>
       <w:r>
-        <w:t>Campus Rental is being developed as a full-stack university housing application. The accepted proposal defines two primary users: Students and Housing Officers. Students will browse available housing, manage a housing application, secure a bed, and complete the leasing process. Housing Officers will manage housing inventory, oversee applications, and manage the leasing workflow.</w:t>
-      </w:r>
-    </w:p>
-    <w:p>
-      <w:r>
-        <w:t>The implementation will prioritize a smaller, well-structured system that works end-to-end over adding a large number of partially completed features. Roommate matching is considered a nice-to-have feature and is not part of the critical implementation path.</w:t>
+        <w:t>Campus Rental is being developed as a full-stack university housing application. The accepted proposal defines two primary users: Students and Housing Officers. Students will manage a housing application, submit residence-hall and room-style preferences, request a known roommate or opt into AI-assisted roommate matching, receive a housing assignment, and complete the leasing process. Housing Officers will manage inventory, oversee applications, review roommate information, make final room/bed assignments, and manage the leasing workflow.</w:t>
+      </w:r>
+    </w:p>
+    <w:p>
+      <w:r>
+        <w:t>The implementation will prioritize a well-structured system that works end-to-end. Following instructor feedback, AI-assisted roommate matching is now a required capstone feature rather than a deferred nice-to-have. The AI feature will remain focused and explainable, while the core housing, assignment, leasing, testing, and deployment workflows remain part of the critical path.</w:t>
       </w:r>
     </w:p>
     <w:p>
@@ -79,7 +79,7 @@
         <w:pStyle w:val="ListBullet"/>
       </w:pPr>
       <w:r>
-        <w:t>External Integration: DocuSign API</w:t>
+        <w:t>External Integrations: DocuSign API and AI-assisted roommate compatibility provider</w:t>
       </w:r>
     </w:p>
     <w:p>
@@ -116,7 +116,7 @@
     </w:p>
     <w:p>
       <w:r>
-        <w:t>The application will initially use a modular monolith rather than separately deployed microservices. Inventory, applications, leases, and authentication will remain distinct logical modules within the Express backend while sharing one deployable API and PostgreSQL database. This preserves clean service boundaries without introducing unnecessary distributed-system complexity.</w:t>
+        <w:t>The application will initially use a modular monolith rather than separately deployed microservices. Inventory, applications, housing assignments, roommate matching, leases, and authentication will remain distinct logical modules within the Express backend while sharing one deployable API and PostgreSQL database. DocuSign and the AI compatibility provider will be isolated behind provider interfaces so external services do not become tightly coupled to the domain model.</w:t>
       </w:r>
     </w:p>
     <w:p>
@@ -124,10 +124,6 @@
         <w:jc w:val="center"/>
       </w:pPr>
       <w:r>
-        <w:rPr>
-          <w:rFonts w:ascii="Consolas" w:hAnsi="Consolas"/>
-          <w:sz w:val="19"/>
-        </w:rPr>
         <w:t>Angular SPA</w:t>
         <w:br/>
         <w:t xml:space="preserve">      ↓</w:t>
@@ -136,11 +132,13 @@
         <w:br/>
         <w:t xml:space="preserve"> ├─ Authentication / Authorization</w:t>
         <w:br/>
-        <w:t xml:space="preserve"> ├─ Inventory</w:t>
+        <w:t xml:space="preserve"> ├─ Inventory &amp; Housing Preferences</w:t>
         <w:br/>
-        <w:t xml:space="preserve"> ├─ Housing Applications</w:t>
+        <w:t xml:space="preserve"> ├─ Housing Applications &amp; Assignments</w:t>
         <w:br/>
-        <w:t xml:space="preserve"> └─ Leases ─────→ DocuSign</w:t>
+        <w:t xml:space="preserve"> ├─ Roommate Matching ─────→ AI Compatibility Provider</w:t>
+        <w:br/>
+        <w:t xml:space="preserve"> └─ Leases ───────────────→ DocuSign</w:t>
         <w:br/>
         <w:t xml:space="preserve">      ↓</w:t>
         <w:br/>
@@ -190,57 +188,32 @@
     </w:p>
     <w:p>
       <w:r>
-        <w:rPr>
-          <w:b/>
-        </w:rPr>
-        <w:t xml:space="preserve">4. Housing Inventory: </w:t>
-      </w:r>
-      <w:r>
-        <w:t>Implement Housing Officer inventory management and Student housing browsing as the first full Angular → API → PostgreSQL vertical slice.</w:t>
-      </w:r>
-    </w:p>
-    <w:p>
-      <w:r>
-        <w:rPr>
-          <w:b/>
-        </w:rPr>
-        <w:t xml:space="preserve">5. Housing Application &amp; Secure Room: </w:t>
-      </w:r>
-      <w:r>
-        <w:t>Implement the housing application lifecycle and transactional Secure Room workflow that prevents conflicting bed reservations.</w:t>
-      </w:r>
-    </w:p>
-    <w:p>
-      <w:r>
-        <w:rPr>
-          <w:b/>
-        </w:rPr>
-        <w:t xml:space="preserve">6. Lease Workflow: </w:t>
-      </w:r>
-      <w:r>
-        <w:t>Generate leases and integrate electronic signature through a provider abstraction backed by DocuSign.</w:t>
-      </w:r>
-    </w:p>
-    <w:p>
-      <w:r>
-        <w:rPr>
-          <w:b/>
-        </w:rPr>
-        <w:t xml:space="preserve">7. Testing &amp; Hardening: </w:t>
-      </w:r>
-      <w:r>
-        <w:t>Add unit/integration tests, workflow tests, validation, error handling, security review, coverage, and useful E2E tests.</w:t>
-      </w:r>
-    </w:p>
-    <w:p>
-      <w:r>
-        <w:rPr>
-          <w:b/>
-        </w:rPr>
-        <w:t xml:space="preserve">8. DevOps, Observability &amp; Documentation: </w:t>
-      </w:r>
-      <w:r>
-        <w:t>Complete CI/CD, Docker execution, health checks, logging/metrics where appropriate, README instructions, architecture documentation, demo data, and final presentation material.</w:t>
+        <w:t>4. Housing Inventory &amp; Preferences: Implement Housing Officer inventory management and Student browsing of residence halls and room styles as the first full Angular → API → PostgreSQL vertical slice.</w:t>
+      </w:r>
+    </w:p>
+    <w:p>
+      <w:r>
+        <w:t>5. Housing Application &amp; Assignment: Implement the application lifecycle, residence-hall/room-style preferences, Housing Officer assignment workflow, and transactional inventory locking that prevents conflicting bed assignments.</w:t>
+      </w:r>
+    </w:p>
+    <w:p>
+      <w:r>
+        <w:t>6. AI Roommate Matching: Implement mutual roommate requests plus opt-in AI-assisted roommate recommendations using structured lifestyle preferences and free-text compatibility analysis.</w:t>
+      </w:r>
+    </w:p>
+    <w:p>
+      <w:r>
+        <w:t>7. Lease Workflow: Generate leases and integrate electronic signature through a provider abstraction backed by DocuSign.</w:t>
+      </w:r>
+    </w:p>
+    <w:p>
+      <w:r>
+        <w:t>8. Testing &amp; Hardening: Add unit/integration tests, workflow tests, validation, error handling, security review, AI-provider mocking, coverage, and useful E2E tests.</w:t>
+      </w:r>
+    </w:p>
+    <w:p>
+      <w:r>
+        <w:t>9. DevOps, Observability &amp; Documentation: Complete CI/CD, Docker execution, health checks, logging/metrics where appropriate, README instructions, architecture documentation, demo data, and final presentation material.</w:t>
       </w:r>
     </w:p>
     <w:p>
@@ -253,7 +226,7 @@
     </w:p>
     <w:p>
       <w:r>
-        <w:t>The domain is divided into an inventory side and a student workflow side. Housing Assignment connects the student's housing process to the physical bed inventory.</w:t>
+        <w:t>The domain is divided into inventory, student housing workflow, and roommate-matching concerns. Housing Assignment connects an approved application to the physical bed inventory, while Roommate Profile and Roommate Request support AI-assisted discovery and mutual student requests without allowing AI to make the final housing assignment.</w:t>
       </w:r>
     </w:p>
     <w:p>
@@ -261,18 +234,19 @@
         <w:jc w:val="center"/>
       </w:pPr>
       <w:r>
-        <w:rPr>
-          <w:rFonts w:ascii="Consolas" w:hAnsi="Consolas"/>
-          <w:sz w:val="19"/>
-        </w:rPr>
-        <w:t>Inventory: Building → Room → Bed</w:t>
+        <w:t>Inventory: Building → Room (room style) → Bed</w:t>
         <w:br/>
         <w:br/>
-        <w:t>Student Workflow: Student → Housing Application → Housing Assignment → Lease</w:t>
+        <w:t>Student Workflow: Student → Housing Application (hall + room-style preferences) → Housing Assignment → Lease</w:t>
         <w:br/>
         <w:t xml:space="preserve">                                              │</w:t>
         <w:br/>
         <w:t xml:space="preserve">                                              └────────→ Bed</w:t>
+        <w:br/>
+        <w:br/>
+        <w:t>Roommate Workflow: Student Profile → Roommate Profile → AI Recommendations</w:t>
+        <w:br/>
+        <w:t xml:space="preserve">                    Student ↔ Roommate Request ↔ Student</w:t>
       </w:r>
     </w:p>
     <w:p>
@@ -359,7 +333,7 @@
           </w:tcPr>
           <w:p>
             <w:r>
-              <w:t>Stores student-specific domain information, such as name and student number, separately from authentication identity.</w:t>
+              <w:t>Stores student-specific domain information including name, student number, gender, academic status, major, and anticipated graduation information separately from authentication identity.</w:t>
             </w:r>
           </w:p>
         </w:tc>
@@ -407,7 +381,7 @@
           </w:tcPr>
           <w:p>
             <w:r>
-              <w:t>Represents a room within a building. A room can contain one or more beds.</w:t>
+              <w:t>Represents a room within a building. A room can contain one or more beds and has a room style used as a student housing preference.</w:t>
             </w:r>
           </w:p>
         </w:tc>
@@ -455,7 +429,7 @@
           </w:tcPr>
           <w:p>
             <w:r>
-              <w:t>Represents a student's request for campus housing and tracks the student's progress through the housing process.</w:t>
+              <w:t>Represents a student's request for campus housing, including preferred residence hall and room style, and tracks progress through the housing process.</w:t>
             </w:r>
           </w:p>
         </w:tc>
@@ -508,6 +482,50 @@
           </w:p>
         </w:tc>
       </w:tr>
+      <w:tr>
+        <w:tc>
+          <w:tcPr>
+            <w:tcW w:type="dxa" w:w="4968"/>
+          </w:tcPr>
+          <w:p>
+            <w:r>
+              <w:t>Roommate Profile</w:t>
+            </w:r>
+          </w:p>
+        </w:tc>
+        <w:tc>
+          <w:tcPr>
+            <w:tcW w:type="dxa" w:w="4968"/>
+          </w:tcPr>
+          <w:p>
+            <w:r>
+              <w:t>Stores opt-in structured lifestyle preferences and short free-text descriptions used for AI-assisted roommate compatibility recommendations.</w:t>
+            </w:r>
+          </w:p>
+        </w:tc>
+      </w:tr>
+      <w:tr>
+        <w:tc>
+          <w:tcPr>
+            <w:tcW w:type="dxa" w:w="4968"/>
+          </w:tcPr>
+          <w:p>
+            <w:r>
+              <w:t>Roommate Request</w:t>
+            </w:r>
+          </w:p>
+        </w:tc>
+        <w:tc>
+          <w:tcPr>
+            <w:tcW w:type="dxa" w:w="4968"/>
+          </w:tcPr>
+          <w:p>
+            <w:r>
+              <w:t>Represents a student-to-student roommate request that must be accepted by the requested student before the pair is considered established.</w:t>
+            </w:r>
+          </w:p>
+        </w:tc>
+      </w:tr>
     </w:tbl>
     <w:p>
       <w:pPr>
@@ -566,6 +584,21 @@
       </w:r>
     </w:p>
     <w:p>
+      <w:r>
+        <w:t>Student Profile 1 → 0..1 Roommate Profile</w:t>
+      </w:r>
+    </w:p>
+    <w:p>
+      <w:r>
+        <w:t>Student ↔ Roommate Request ↔ Student</w:t>
+      </w:r>
+    </w:p>
+    <w:p>
+      <w:r>
+        <w:t>Housing Application → preferred Building + preferred Room Style</w:t>
+      </w:r>
+    </w:p>
+    <w:p>
       <w:pPr>
         <w:pStyle w:val="Heading1"/>
       </w:pPr>
@@ -575,13 +608,7 @@
     </w:p>
     <w:p>
       <w:r>
-        <w:rPr>
-          <w:b/>
-        </w:rPr>
-        <w:t xml:space="preserve">Meaning of Secure Room: </w:t>
-      </w:r>
-      <w:r>
-        <w:t>Secure Room creates a RESERVED Housing Assignment rather than immediately finalizing the student's housing assignment.</w:t>
+        <w:t>Meaning of Housing Assignment: Students request a preferred residence hall and room style rather than a specific room/bed. A Housing Officer makes the actual assignment. Creating the assignment reserves the selected bed (RESERVED) rather than immediately finalizing the housing placement.</w:t>
       </w:r>
     </w:p>
     <w:p>
@@ -697,7 +724,7 @@
           </w:tcPr>
           <w:p>
             <w:r>
-              <w:t>DRAFT → SUBMITTED → APPROVED → ROOM_SECURED → COMPLETED</w:t>
+              <w:t>DRAFT → SUBMITTED → APPROVED → HOUSING_ASSIGNED → COMPLETED</w:t>
               <w:br/>
               <w:t>Cancellation is permitted where appropriate before completion.</w:t>
             </w:r>
@@ -758,12 +785,12 @@
         <w:pStyle w:val="Heading1"/>
       </w:pPr>
       <w:r>
-        <w:t>10. Secure Room Transaction</w:t>
-      </w:r>
-    </w:p>
-    <w:p>
-      <w:r>
-        <w:t>The Secure Room operation is the central non-CRUD workflow. The frontend will not be trusted to prevent conflicting reservations. The Express backend and PostgreSQL database will enforce the invariant so that two concurrent requests cannot successfully reserve the same bed.</w:t>
+        <w:t>10. Housing Assignment Transaction</w:t>
+      </w:r>
+    </w:p>
+    <w:p>
+      <w:r>
+        <w:t>The Housing Assignment operation remains a central non-CRUD workflow. Students submit housing preferences rather than selecting a specific bed. When a Housing Officer assigns a bed, the Express backend and PostgreSQL database will enforce the invariant so that concurrent administrative actions cannot successfully reserve the same bed.</w:t>
       </w:r>
     </w:p>
     <w:p>
@@ -771,15 +798,11 @@
         <w:jc w:val="center"/>
       </w:pPr>
       <w:r>
-        <w:rPr>
-          <w:rFonts w:ascii="Consolas" w:hAnsi="Consolas"/>
-          <w:sz w:val="18"/>
-        </w:rPr>
-        <w:t>Student selects a bed</w:t>
+        <w:t>Housing Officer reviews approved application, housing preferences, and roommate information</w:t>
         <w:br/>
         <w:t xml:space="preserve">        ↓</w:t>
         <w:br/>
-        <w:t>Backend verifies application ownership and eligibility</w:t>
+        <w:t>Backend verifies application eligibility and inventory availability</w:t>
         <w:br/>
         <w:t xml:space="preserve">        ↓</w:t>
         <w:br/>
@@ -789,18 +812,18 @@
         <w:br/>
         <w:t>┌──────────────────────┬────────────────────────┐</w:t>
         <w:br/>
-        <w:t>│ Success              │ Bed already reserved   │</w:t>
+        <w:t>│ Success              │ Bed already assigned   │</w:t>
         <w:br/>
         <w:t>│ Assignment RESERVED  │ 409 Conflict           │</w:t>
         <w:br/>
-        <w:t>│ Application secured  │ No assignment created  │</w:t>
+        <w:t>│ Housing assigned     │ No assignment created  │</w:t>
         <w:br/>
         <w:t>└──────────────────────┴────────────────────────┘</w:t>
       </w:r>
     </w:p>
     <w:p>
       <w:r>
-        <w:t>Architectural decision: bed availability will be enforced by the backend and PostgreSQL. The Secure Room workflow will use a database transaction together with database-level constraints to prevent multiple active assignments for the same bed.</w:t>
+        <w:t>Architectural decision: bed availability will be enforced by the backend and PostgreSQL. The Housing Assignment workflow will use a database transaction together with database-level constraints to prevent multiple active assignments for the same bed.</w:t>
       </w:r>
     </w:p>
     <w:p>
@@ -889,7 +912,7 @@
         <w:pStyle w:val="ListBullet"/>
       </w:pPr>
       <w:r>
-        <w:t>Roommate matching remains deferred until the must-have workflow is complete.</w:t>
+        <w:t>AI-assisted roommate matching is a required capstone feature. It will recommend compatible roommates but will never automatically pair students or make housing eligibility/assignment decisions.</w:t>
       </w:r>
     </w:p>
     <w:p>
@@ -1048,6 +1071,22 @@
     </w:p>
     <w:p>
       <w:pPr>
+        <w:pStyle w:val="ListBullet"/>
+      </w:pPr>
+      <w:r>
+        <w:t>roommate_profiles</w:t>
+      </w:r>
+    </w:p>
+    <w:p>
+      <w:pPr>
+        <w:pStyle w:val="ListBullet"/>
+      </w:pPr>
+      <w:r>
+        <w:t>roommate_requests</w:t>
+      </w:r>
+    </w:p>
+    <w:p>
+      <w:pPr>
         <w:pStyle w:val="Heading1"/>
       </w:pPr>
       <w:r>
@@ -1069,7 +1108,7 @@
     </w:p>
     <w:p>
       <w:r>
-        <w:t>Decision status: Settled. The Node.js/Express backend will use the PostgreSQL pg driver with explicit SQL migrations rather than a full ORM. This keeps SQL, PostgreSQL constraints, and transaction boundaries visible, especially for the Secure Room workflow.</w:t>
+        <w:t>Decision status: Settled. The Node.js/Express backend will use the PostgreSQL pg driver with explicit SQL migrations rather than a full ORM. This keeps SQL, PostgreSQL constraints, and transaction boundaries visible, especially for the transactional Housing Assignment workflow.</w:t>
       </w:r>
     </w:p>
     <w:p>
@@ -1197,7 +1236,7 @@
         <w:pStyle w:val="ListBullet"/>
       </w:pPr>
       <w:r>
-        <w:t>External integration: DocuSign behind an electronic-signature provider abstraction</w:t>
+        <w:t>External integrations: DocuSign behind an electronic-signature provider abstraction; AI compatibility behind an AI provider abstraction</w:t>
       </w:r>
     </w:p>
     <w:p>
@@ -1351,6 +1390,38 @@
         <w:pStyle w:val="ListBullet"/>
       </w:pPr>
       <w:r>
+        <w:t>academic_status: VARCHAR(30) NOT NULL — FRESHMAN, SOPHOMORE, JUNIOR, SENIOR, or GRADUATE</w:t>
+      </w:r>
+    </w:p>
+    <w:p>
+      <w:pPr>
+        <w:pStyle w:val="ListBullet"/>
+      </w:pPr>
+      <w:r>
+        <w:t>major: VARCHAR(150) NOT NULL</w:t>
+      </w:r>
+    </w:p>
+    <w:p>
+      <w:pPr>
+        <w:pStyle w:val="ListBullet"/>
+      </w:pPr>
+      <w:r>
+        <w:t>anticipated_graduation_semester: VARCHAR(20) NULL — SPRING, SUMMER, or FALL</w:t>
+      </w:r>
+    </w:p>
+    <w:p>
+      <w:pPr>
+        <w:pStyle w:val="ListBullet"/>
+      </w:pPr>
+      <w:r>
+        <w:t>anticipated_graduation_year: INTEGER NULL</w:t>
+      </w:r>
+    </w:p>
+    <w:p>
+      <w:pPr>
+        <w:pStyle w:val="ListBullet"/>
+      </w:pPr>
+      <w:r>
         <w:t>created_at: TIMESTAMPTZ NOT NULL DEFAULT NOW()</w:t>
       </w:r>
     </w:p>
@@ -1494,6 +1565,14 @@
         <w:pStyle w:val="ListBullet"/>
       </w:pPr>
       <w:r>
+        <w:t>room_style: VARCHAR(20) NOT NULL — SINGLE, DOUBLE, TRIPLE, or QUAD</w:t>
+      </w:r>
+    </w:p>
+    <w:p>
+      <w:pPr>
+        <w:pStyle w:val="ListBullet"/>
+      </w:pPr>
+      <w:r>
         <w:t>active: BOOLEAN NOT NULL DEFAULT TRUE</w:t>
       </w:r>
     </w:p>
@@ -1622,7 +1701,7 @@
         <w:pStyle w:val="ListBullet"/>
       </w:pPr>
       <w:r>
-        <w:t>A bed is available for selection when it is administratively eligible and has no active Housing Assignment.</w:t>
+        <w:t>A bed is available for assignment when it is administratively eligible and has no active Housing Assignment.</w:t>
       </w:r>
     </w:p>
     <w:p>
@@ -1656,7 +1735,7 @@
     </w:p>
     <w:p>
       <w:r>
-        <w:t>Room type and gender-based building/room restrictions will not be modeled in the current capstone scope. Room capacity can be derived from beds, making SINGLE/DOUBLE/TRIPLE/QUAD redundant for current needs. Future housing-policy rules could combine student profile attributes such as gender with building or room eligibility/designation data without changing the fundamental inventory hierarchy.</w:t>
+        <w:t>Room style is now a required domain attribute because students will request a preferred room style. Room capacity is still derived from beds. Gender-based building/room restrictions remain outside the current capstone scope and will not be used by the AI compatibility score. Future deterministic housing-policy rules could use student profile attributes without changing the fundamental inventory hierarchy.</w:t>
       </w:r>
     </w:p>
     <w:p>
@@ -1669,7 +1748,7 @@
     </w:p>
     <w:p>
       <w:r>
-        <w:t>The identity/profile and physical housing inventory portions of the schema are now settled. The next schema design task is housing_applications, followed by housing_assignments and leases. These tables will implement the agreed application lifecycle and Secure Room workflow.</w:t>
+        <w:t>The identity/profile and physical housing inventory portions of the schema are now settled. The next schema design task is housing_applications, followed by housing_assignments and leases. These tables will implement the agreed application lifecycle and Housing Assignment workflow.</w:t>
       </w:r>
     </w:p>
     <w:p>
@@ -1722,6 +1801,22 @@
         <w:pStyle w:val="ListBullet"/>
       </w:pPr>
       <w:r>
+        <w:t>preferred_building_id: BIGINT NOT NULL, FOREIGN KEY → buildings.id</w:t>
+      </w:r>
+    </w:p>
+    <w:p>
+      <w:pPr>
+        <w:pStyle w:val="ListBullet"/>
+      </w:pPr>
+      <w:r>
+        <w:t>preferred_room_style: VARCHAR(20) NOT NULL — SINGLE, DOUBLE, TRIPLE, or QUAD</w:t>
+      </w:r>
+    </w:p>
+    <w:p>
+      <w:pPr>
+        <w:pStyle w:val="ListBullet"/>
+      </w:pPr>
+      <w:r>
         <w:t>status: VARCHAR(30) NOT NULL</w:t>
       </w:r>
     </w:p>
@@ -1762,7 +1857,7 @@
         <w:pStyle w:val="ListBullet"/>
       </w:pPr>
       <w:r>
-        <w:t>room_secured_at: TIMESTAMPTZ NULL</w:t>
+        <w:t>housing_assigned_at: TIMESTAMPTZ NULL</w:t>
       </w:r>
     </w:p>
     <w:p>
@@ -1815,7 +1910,7 @@
     </w:p>
     <w:p>
       <w:r>
-        <w:t>DRAFT → SUBMITTED → APPROVED → ROOM_SECURED → COMPLETED</w:t>
+        <w:t>DRAFT → SUBMITTED → APPROVED → HOUSING_ASSIGNED → COMPLETED</w:t>
       </w:r>
     </w:p>
     <w:p>
@@ -1833,7 +1928,7 @@
     </w:p>
     <w:p>
       <w:r>
-        <w:t>A student may have only one unsecured active application at a time. DRAFT, SUBMITTED, and APPROVED are considered blocking states. Once an application reaches ROOM_SECURED, the student may create another application, including during the same academic year. This supports legitimate mid-year room-change scenarios while preserving the history of the original application and assignment. The rule is expected to be enforced using a PostgreSQL partial unique index.</w:t>
+        <w:t>A student may have only one unsecured active application at a time. DRAFT, SUBMITTED, and APPROVED are considered blocking states. Once an application reaches HOUSING_ASSIGNED, the student may create another application, including during the same academic year. This supports legitimate mid-year room-change scenarios while preserving the history of the original application and assignment. The rule is expected to be enforced using a PostgreSQL partial unique index.</w:t>
       </w:r>
     </w:p>
     <w:p>
@@ -1872,7 +1967,7 @@
     </w:p>
     <w:p>
       <w:r>
-        <w:t>Fields such as room_secured_by and completed_by will not be added. The Housing Assignment and Lease records will already represent the actions that cause those state changes, avoiding unnecessary duplication and preventing housing_applications from becoming an oversized audit log.</w:t>
+        <w:t>Fields such as housing_assigned_by and completed_by will not be added. The Housing Assignment and Lease records will already represent the actions that cause those state changes, avoiding unnecessary duplication and preventing housing_applications from becoming an oversized audit log.</w:t>
       </w:r>
     </w:p>
     <w:p>
@@ -1885,7 +1980,7 @@
     </w:p>
     <w:p>
       <w:r>
-        <w:t>The behavior of an existing confirmed Housing Assignment when a student secures a new room through a later room-change application remains intentionally open. This will be resolved during the housing_assignments schema and workflow design.</w:t>
+        <w:t>The behavior of an existing confirmed Housing Assignment when a student receives a new room assignment through a later room-change application remains intentionally open. This will be resolved during the housing_assignments schema and workflow design.</w:t>
       </w:r>
     </w:p>
     <w:p>
@@ -1898,7 +1993,7 @@
     </w:p>
     <w:p>
       <w:r>
-        <w:t>The next schema design task is housing_assignments. This will define how a secured bed is represented, how active assignment uniqueness is enforced, how RESERVED and CONFIRMED states work, and how a mid-year room change affects the student's previous confirmed assignment.</w:t>
+        <w:t>The next schema design task is housing_assignments. This will define how an assigned bed is represented, how active assignment uniqueness is enforced, how RESERVED and CONFIRMED states work, and how a mid-year room change affects the student's previous confirmed assignment.</w:t>
       </w:r>
     </w:p>
     <w:p>
@@ -2063,12 +2158,12 @@
         <w:pStyle w:val="Heading2"/>
       </w:pPr>
       <w:r>
-        <w:t>Secure Room transaction</w:t>
-      </w:r>
-    </w:p>
-    <w:p>
-      <w:r>
-        <w:t>Secure Room will validate that the application is APPROVED and belongs to the student, verify that the building, room, and bed are administratively active, create a RESERVED Housing Assignment, and transition the Housing Application to ROOM_SECURED in one database transaction. A competing reservation that violates the active-bed uniqueness constraint will roll back and return an HTTP 409 Conflict.</w:t>
+        <w:t>Housing Assignment transaction</w:t>
+      </w:r>
+    </w:p>
+    <w:p>
+      <w:r>
+        <w:t>Housing Assignment will validate that the application is APPROVED, verify the selected building/room/bed are administratively active and appropriate for the approved preference workflow, create a RESERVED Housing Assignment, and transition the Housing Application to HOUSING_ASSIGNED in one database transaction. A competing assignment that violates the active-bed uniqueness constraint will roll back and return an HTTP 409 Conflict.</w:t>
       </w:r>
     </w:p>
     <w:p>
@@ -2307,7 +2402,7 @@
     </w:p>
     <w:p>
       <w:r>
-        <w:t>Successful external signature confirmation is a business event. In one PostgreSQL transaction the system will mark the Lease SIGNED and set signed_at, transition the new Housing Assignment from RESERVED to CONFIRMED and set confirmed_at, transition the Housing Application from ROOM_SECURED to COMPLETED and set completed_at, and—when this is a room change—transition the student's previous CONFIRMED assignment to SUPERSEDED and set superseded_at. The transaction prevents partially completed workflow state.</w:t>
+        <w:t>Successful external signature confirmation is a business event. In one PostgreSQL transaction the system will mark the Lease SIGNED and set signed_at, transition the new Housing Assignment from RESERVED to CONFIRMED and set confirmed_at, transition the Housing Application from HOUSING_ASSIGNED to COMPLETED and set completed_at, and—when this is a room change—transition the student's previous CONFIRMED assignment to SUPERSEDED and set superseded_at. The transaction prevents partially completed workflow state.</w:t>
       </w:r>
     </w:p>
     <w:p>
@@ -2364,13 +2459,7 @@
     </w:p>
     <w:p>
       <w:r>
-        <w:rPr>
-          <w:b/>
-        </w:rPr>
-        <w:t xml:space="preserve">Transactional application cancellation: </w:t>
-      </w:r>
-      <w:r>
-        <w:t>Cancelling a ROOM_SECURED application must occur in one transaction that also changes its RESERVED Housing Assignment to CANCELLED and voids any unfinished Lease. This prevents a cancelled application from leaving a bed reserved.</w:t>
+        <w:t>Transactional application cancellation: Cancelling a HOUSING_ASSIGNED application must occur in one transaction that also changes its RESERVED Housing Assignment to CANCELLED and voids any unfinished Lease. This prevents a cancelled application from leaving a bed reserved.</w:t>
       </w:r>
     </w:p>
     <w:p>
@@ -2419,13 +2508,7 @@
     </w:p>
     <w:p>
       <w:r>
-        <w:rPr>
-          <w:b/>
-        </w:rPr>
-        <w:t xml:space="preserve">One unsecured application per student: </w:t>
-      </w:r>
-      <w:r>
-        <w:t>A PostgreSQL partial unique index on housing_applications(student_id) will apply while status is DRAFT, SUBMITTED, or APPROVED. ROOM_SECURED applications no longer block creation of another application.</w:t>
+        <w:t>One unsecured application per student: A PostgreSQL partial unique index on housing_applications(student_id) will apply while status is DRAFT, SUBMITTED, or APPROVED. HOUSING_ASSIGNED applications no longer block creation of another application.</w:t>
       </w:r>
     </w:p>
     <w:p>
@@ -2546,7 +2629,7 @@
     </w:p>
     <w:p>
       <w:r>
-        <w:t>rooms.floor will remain a nullable integer for the capstone. A generic housing_applications.updated_by field will not be added because significant administrative actions already have meaningful actor fields (approved_by and cancelled_by). No additional domain table was found necessary during the review.</w:t>
+        <w:t>rooms.floor will remain a nullable integer for the capstone. A generic housing_applications.updated_by field will not be added because significant administrative actions already have meaningful actor fields (approved_by and cancelled_by). At that stage no additional domain table was found necessary; this conclusion is superseded by the roommate-profile and roommate-request additions in Section 37.</w:t>
       </w:r>
     </w:p>
     <w:p>
@@ -2554,12 +2637,12 @@
         <w:pStyle w:val="Heading1"/>
       </w:pPr>
       <w:r>
-        <w:t>30. Database Design Approval</w:t>
-      </w:r>
-    </w:p>
-    <w:p>
-      <w:r>
-        <w:t>The database design is approved for implementation with eight major tables: users, student_profiles, buildings, rooms, beds, housing_applications, housing_assignments, and leases. The design supports the normal housing workflow, competing Secure Room requests, cancellation, lease completion, and mid-year room changes while preserving historical records.</w:t>
+        <w:t>30. Database Design Approval (Superseded by Instructor Feedback Scope Expansion)</w:t>
+      </w:r>
+    </w:p>
+    <w:p>
+      <w:r>
+        <w:t>The original eight-table database design was approved before instructor feedback expanded the project scope. The core tables remain valid, but the schema must now be extended for room style, housing preferences, richer student academic data, roommate profiles, and mutual roommate requests. The revised schema decisions in Section 33 and later supersede conflicting earlier assumptions.</w:t>
       </w:r>
     </w:p>
     <w:p>
@@ -2645,7 +2728,7 @@
           </w:tcPr>
           <w:p>
             <w:r>
-              <w:t>Angular SPA → modular Node.js/Express API → PostgreSQL, with logical authentication, inventory, application, and lease modules plus an external electronic-signature provider.</w:t>
+              <w:t>Angular SPA → modular Node.js/Express API → PostgreSQL, with authentication, inventory/preferences, applications/assignments, roommate matching, and lease modules plus DocuSign and AI-provider integrations.</w:t>
             </w:r>
           </w:p>
         </w:tc>
@@ -2677,7 +2760,7 @@
           </w:tcPr>
           <w:p>
             <w:r>
-              <w:t>Angular/TypeScript, Express/TypeScript, PostgreSQL/pg, SQL migrations, Docker/Docker Compose, GitHub Actions, and DocuSign integration.</w:t>
+              <w:t>Angular/TypeScript, Express/TypeScript, PostgreSQL/pg, SQL migrations, Docker/Docker Compose, GitHub Actions, DocuSign, and an AI compatibility provider behind a service abstraction.</w:t>
             </w:r>
           </w:p>
         </w:tc>
@@ -2741,7 +2824,7 @@
           </w:tcPr>
           <w:p>
             <w:r>
-              <w:t>Unit/integration/workflow testing is part of the implementation phases. Secure Room concurrency, state transitions, API authorization, and lease completion should receive explicit tests.</w:t>
+              <w:t>Unit/integration/workflow testing is part of the implementation phases. Transactional assignment concurrency, state transitions, API authorization, roommate-request consent, AI-provider mocking/ranking behavior, and lease completion should receive explicit tests.</w:t>
             </w:r>
           </w:p>
         </w:tc>
@@ -3009,7 +3092,7 @@
           </w:tcPr>
           <w:p>
             <w:r>
-              <w:t>Housing inventory and room selection</w:t>
+              <w:t>Housing inventory and preference/assignment workflow</w:t>
             </w:r>
           </w:p>
         </w:tc>
@@ -3029,7 +3112,7 @@
           </w:tcPr>
           <w:p>
             <w:r>
-              <w:t>Building → Room → Bed model and derived availability rules are settled; CRUD/browse functionality remains to be implemented.</w:t>
+              <w:t>Building → Room → Bed model remains, with room style added. Students request hall/room-style preferences; Housing Officers make the final room/bed assignment transactionally.</w:t>
             </w:r>
           </w:p>
         </w:tc>
@@ -3041,7 +3124,7 @@
           </w:tcPr>
           <w:p>
             <w:r>
-              <w:t>Housing application and Secure Room workflow</w:t>
+              <w:t>Housing application and assignment workflow</w:t>
             </w:r>
           </w:p>
         </w:tc>
@@ -3061,7 +3144,7 @@
           </w:tcPr>
           <w:p>
             <w:r>
-              <w:t>Lifecycle, transactional reservation behavior, uniqueness constraints, cancellation, and room-change behavior are settled; implementation remains.</w:t>
+              <w:t>Lifecycle, hall/room-style preferences, transactional assignment behavior, uniqueness constraints, cancellation, and room-change behavior are defined; implementation remains.</w:t>
             </w:r>
           </w:p>
         </w:tc>
@@ -3322,6 +3405,38 @@
           </w:p>
         </w:tc>
       </w:tr>
+      <w:tr>
+        <w:tc>
+          <w:tcPr>
+            <w:tcW w:type="dxa" w:w="3312"/>
+          </w:tcPr>
+          <w:p>
+            <w:r>
+              <w:t>AI-assisted roommate matching</w:t>
+            </w:r>
+          </w:p>
+        </w:tc>
+        <w:tc>
+          <w:tcPr>
+            <w:tcW w:type="dxa" w:w="3312"/>
+          </w:tcPr>
+          <w:p>
+            <w:r>
+              <w:t>Designed / required by instructor feedback</w:t>
+            </w:r>
+          </w:p>
+        </w:tc>
+        <w:tc>
+          <w:tcPr>
+            <w:tcW w:type="dxa" w:w="3312"/>
+          </w:tcPr>
+          <w:p>
+            <w:r>
+              <w:t>Students may request a known roommate with mutual consent or opt into AI recommendations. AI uses structured lifestyle preferences plus free-text semantic compatibility, excludes protected/sensitive traits from scoring, explains recommendations, and never auto-pairs students.</w:t>
+            </w:r>
+          </w:p>
+        </w:tc>
+      </w:tr>
     </w:tbl>
     <w:p>
       <w:pPr>
@@ -3401,6 +3516,438 @@
       </w:pPr>
       <w:r>
         <w:t>Prepare the required 5–10 slide presentation and 10–15 minute recorded demo during the final project phase.</w:t>
+      </w:r>
+    </w:p>
+    <w:p>
+      <w:pPr>
+        <w:pStyle w:val="Heading1"/>
+      </w:pPr>
+      <w:r>
+        <w:t>33. Instructor Feedback Scope Expansion</w:t>
+      </w:r>
+    </w:p>
+    <w:p>
+      <w:r>
+        <w:t>Instructor feedback identified the original proposal as being on the simpler side for a master's-level capstone and specifically recommended adding an AI-based angle such as AI roommate matching. The following decisions are now part of the required project scope and supersede conflicting earlier statements that described roommate matching as deferred or students selecting a specific bed.</w:t>
+      </w:r>
+    </w:p>
+    <w:p>
+      <w:pPr>
+        <w:pStyle w:val="ListBullet"/>
+      </w:pPr>
+      <w:r>
+        <w:t>AI-assisted roommate matching is a required feature, not a nice-to-have.</w:t>
+      </w:r>
+    </w:p>
+    <w:p>
+      <w:pPr>
+        <w:pStyle w:val="ListBullet"/>
+      </w:pPr>
+      <w:r>
+        <w:t>Students request a preferred residence hall and room style instead of choosing a specific room/bed.</w:t>
+      </w:r>
+    </w:p>
+    <w:p>
+      <w:pPr>
+        <w:pStyle w:val="ListBullet"/>
+      </w:pPr>
+      <w:r>
+        <w:t>Housing Officers make the final room/bed assignment using application preferences, inventory availability, and roommate information.</w:t>
+      </w:r>
+    </w:p>
+    <w:p>
+      <w:pPr>
+        <w:pStyle w:val="ListBullet"/>
+      </w:pPr>
+      <w:r>
+        <w:t>The transactional PostgreSQL uniqueness protections remain in place so two assignments cannot claim the same active bed.</w:t>
+      </w:r>
+    </w:p>
+    <w:p>
+      <w:pPr>
+        <w:pStyle w:val="ListBullet"/>
+      </w:pPr>
+      <w:r>
+        <w:t>The repository will be private and the instructor will be added as a GitHub collaborator/observer as requested.</w:t>
+      </w:r>
+    </w:p>
+    <w:p>
+      <w:pPr>
+        <w:pStyle w:val="Heading1"/>
+      </w:pPr>
+      <w:r>
+        <w:t>34. Expanded Student Profile</w:t>
+      </w:r>
+    </w:p>
+    <w:p>
+      <w:r>
+        <w:t>The student profile is expanded to provide useful academic context for housing administration and roommate discovery.</w:t>
+      </w:r>
+    </w:p>
+    <w:p>
+      <w:pPr>
+        <w:pStyle w:val="ListBullet"/>
+      </w:pPr>
+      <w:r>
+        <w:t>academic_status: FRESHMAN, SOPHOMORE, JUNIOR, SENIOR, or GRADUATE</w:t>
+      </w:r>
+    </w:p>
+    <w:p>
+      <w:pPr>
+        <w:pStyle w:val="ListBullet"/>
+      </w:pPr>
+      <w:r>
+        <w:t>major: student academic major</w:t>
+      </w:r>
+    </w:p>
+    <w:p>
+      <w:pPr>
+        <w:pStyle w:val="ListBullet"/>
+      </w:pPr>
+      <w:r>
+        <w:t>anticipated_graduation_semester: SPRING, SUMMER, or FALL</w:t>
+      </w:r>
+    </w:p>
+    <w:p>
+      <w:pPr>
+        <w:pStyle w:val="ListBullet"/>
+      </w:pPr>
+      <w:r>
+        <w:t>anticipated_graduation_year: anticipated graduation year</w:t>
+      </w:r>
+    </w:p>
+    <w:p>
+      <w:r>
+        <w:t>Academic information may be displayed to roommate candidates. It will not automatically be treated as a strong compatibility factor unless a student explicitly indicates that similar academic stage/interests matter to them.</w:t>
+      </w:r>
+    </w:p>
+    <w:p>
+      <w:pPr>
+        <w:pStyle w:val="Heading1"/>
+      </w:pPr>
+      <w:r>
+        <w:t>35. Housing Preference and Assignment Revision</w:t>
+      </w:r>
+    </w:p>
+    <w:p>
+      <w:r>
+        <w:t>Students will no longer request an exact room or bed. A housing application will capture a preferred residence hall and preferred room style (SINGLE, DOUBLE, TRIPLE, or QUAD). These are preferences rather than guarantees. Room style is therefore now a meaningful Room domain attribute even though physical capacity continues to be derived from Bed records.</w:t>
+      </w:r>
+    </w:p>
+    <w:p>
+      <w:r>
+        <w:t>After application approval and roommate processing, a Housing Officer selects the actual room/bed. The backend creates the RESERVED Housing Assignment and transitions the application to HOUSING_ASSIGNED in one transaction. Lease signing later transitions the assignment to CONFIRMED and the application to COMPLETED. Existing room-change and historical-record rules remain applicable.</w:t>
+      </w:r>
+    </w:p>
+    <w:p>
+      <w:pPr>
+        <w:pStyle w:val="Heading1"/>
+      </w:pPr>
+      <w:r>
+        <w:t>36. Roommate Requests and AI Roommate Profiles</w:t>
+      </w:r>
+    </w:p>
+    <w:p>
+      <w:r>
+        <w:t>Students have two roommate paths: a direct mutual request or opt-in AI-assisted discovery.</w:t>
+      </w:r>
+    </w:p>
+    <w:p>
+      <w:pPr>
+        <w:pStyle w:val="ListBullet"/>
+      </w:pPr>
+      <w:r>
+        <w:t>Direct request: a student may search for another student by name or student number and send a roommate request. The requested student must explicitly accept before the pair is established.</w:t>
+      </w:r>
+    </w:p>
+    <w:p>
+      <w:pPr>
+        <w:pStyle w:val="ListBullet"/>
+      </w:pPr>
+      <w:r>
+        <w:t>An accepted direct roommate request takes priority over AI matching for that housing cycle.</w:t>
+      </w:r>
+    </w:p>
+    <w:p>
+      <w:pPr>
+        <w:pStyle w:val="ListBullet"/>
+      </w:pPr>
+      <w:r>
+        <w:t>AI discovery: students without an accepted direct request may opt into AI-assisted recommendations. AI recommendations never automatically pair students; a student still sends a request and the recipient accepts or declines.</w:t>
+      </w:r>
+    </w:p>
+    <w:p>
+      <w:r>
+        <w:t>The AI roommate profile will collect a focused set of structured lifestyle preferences:</w:t>
+      </w:r>
+    </w:p>
+    <w:p>
+      <w:pPr>
+        <w:pStyle w:val="ListBullet"/>
+      </w:pPr>
+      <w:r>
+        <w:t>Sleep schedule and wake schedule</w:t>
+      </w:r>
+    </w:p>
+    <w:p>
+      <w:pPr>
+        <w:pStyle w:val="ListBullet"/>
+      </w:pPr>
+      <w:r>
+        <w:t>Cleanliness preference</w:t>
+      </w:r>
+    </w:p>
+    <w:p>
+      <w:pPr>
+        <w:pStyle w:val="ListBullet"/>
+      </w:pPr>
+      <w:r>
+        <w:t>Study environment</w:t>
+      </w:r>
+    </w:p>
+    <w:p>
+      <w:pPr>
+        <w:pStyle w:val="ListBullet"/>
+      </w:pPr>
+      <w:r>
+        <w:t>Noise tolerance</w:t>
+      </w:r>
+    </w:p>
+    <w:p>
+      <w:pPr>
+        <w:pStyle w:val="ListBullet"/>
+      </w:pPr>
+      <w:r>
+        <w:t>Social preference</w:t>
+      </w:r>
+    </w:p>
+    <w:p>
+      <w:pPr>
+        <w:pStyle w:val="ListBullet"/>
+      </w:pPr>
+      <w:r>
+        <w:t>Guest frequency</w:t>
+      </w:r>
+    </w:p>
+    <w:p>
+      <w:pPr>
+        <w:pStyle w:val="ListBullet"/>
+      </w:pPr>
+      <w:r>
+        <w:t>Typical room use</w:t>
+      </w:r>
+    </w:p>
+    <w:p>
+      <w:pPr>
+        <w:pStyle w:val="ListBullet"/>
+      </w:pPr>
+      <w:r>
+        <w:t>Shared-belongings preference</w:t>
+      </w:r>
+    </w:p>
+    <w:p>
+      <w:pPr>
+        <w:pStyle w:val="ListBullet"/>
+      </w:pPr>
+      <w:r>
+        <w:t>Temperature preference</w:t>
+      </w:r>
+    </w:p>
+    <w:p>
+      <w:pPr>
+        <w:pStyle w:val="ListBullet"/>
+      </w:pPr>
+      <w:r>
+        <w:t>Communication style</w:t>
+      </w:r>
+    </w:p>
+    <w:p>
+      <w:pPr>
+        <w:pStyle w:val="ListBullet"/>
+      </w:pPr>
+      <w:r>
+        <w:t>Conflict-resolution approach</w:t>
+      </w:r>
+    </w:p>
+    <w:p>
+      <w:pPr>
+        <w:pStyle w:val="ListBullet"/>
+      </w:pPr>
+      <w:r>
+        <w:t>Up to three priorities that matter most to the student</w:t>
+      </w:r>
+    </w:p>
+    <w:p>
+      <w:pPr>
+        <w:pStyle w:val="ListBullet"/>
+      </w:pPr>
+      <w:r>
+        <w:t>Short About Me and What I Am Looking For in a Roommate text fields</w:t>
+      </w:r>
+    </w:p>
+    <w:p>
+      <w:r>
+        <w:t>AI matching will use a hybrid approach: deterministic comparison of structured preferences provides the majority of the compatibility score, while an AI provider performs semantic analysis of the free-text profile and helps generate a concise explanation of the recommendation. Exact weights may be tuned during implementation, but the matching service—not the external model—owns the business rules.</w:t>
+      </w:r>
+    </w:p>
+    <w:p>
+      <w:pPr>
+        <w:pStyle w:val="ListBullet"/>
+      </w:pPr>
+      <w:r>
+        <w:t>Gender will not be included in the AI compatibility score.</w:t>
+      </w:r>
+    </w:p>
+    <w:p>
+      <w:pPr>
+        <w:pStyle w:val="ListBullet"/>
+      </w:pPr>
+      <w:r>
+        <w:t>Race, ethnicity, religion, sexual orientation, disability, political beliefs, and other protected/sensitive characteristics will not be collected for or used by roommate compatibility scoring.</w:t>
+      </w:r>
+    </w:p>
+    <w:p>
+      <w:pPr>
+        <w:pStyle w:val="ListBullet"/>
+      </w:pPr>
+      <w:r>
+        <w:t>Housing eligibility rules, if ever added, must remain deterministic policy rules separate from AI roommate compatibility.</w:t>
+      </w:r>
+    </w:p>
+    <w:p>
+      <w:pPr>
+        <w:pStyle w:val="ListBullet"/>
+      </w:pPr>
+      <w:r>
+        <w:t>AI recommendations should explain major compatibility strengths and notable preference differences rather than presenting an unexplained numeric score.</w:t>
+      </w:r>
+    </w:p>
+    <w:p>
+      <w:pPr>
+        <w:pStyle w:val="Heading1"/>
+      </w:pPr>
+      <w:r>
+        <w:t>37. Revised Roommate Data Model and Provider Architecture</w:t>
+      </w:r>
+    </w:p>
+    <w:p>
+      <w:r>
+        <w:t>The schema will be expanded beyond the original eight tables with two additional domain tables. Exact SQL types/constraints will be finalized before migrations are written.</w:t>
+      </w:r>
+    </w:p>
+    <w:p>
+      <w:pPr>
+        <w:pStyle w:val="ListBullet"/>
+      </w:pPr>
+      <w:r>
+        <w:t>roommate_profiles: one optional profile per student containing opt-in status, structured lifestyle preferences, priority preferences, and short free-text profile fields.</w:t>
+      </w:r>
+    </w:p>
+    <w:p>
+      <w:pPr>
+        <w:pStyle w:val="ListBullet"/>
+      </w:pPr>
+      <w:r>
+        <w:t>roommate_requests: records requester, requested student, academic year, request status (PENDING, ACCEPTED, DECLINED, CANCELLED), and response timestamps. Self-requests and duplicate active pair requests will be prevented.</w:t>
+      </w:r>
+    </w:p>
+    <w:p>
+      <w:r>
+        <w:t>Provider architecture:</w:t>
+      </w:r>
+    </w:p>
+    <w:p>
+      <w:r>
+        <w:rPr>
+          <w:rFonts w:ascii="Consolas" w:hAnsi="Consolas"/>
+          <w:sz w:val="19"/>
+        </w:rPr>
+        <w:t>RoommateMatchingService → AICompatibilityProvider → RealAIProvider / MockAIProvider</w:t>
+      </w:r>
+    </w:p>
+    <w:p>
+      <w:r>
+        <w:t>The mock provider will support deterministic automated tests and a reliable demonstration path when an external AI service is unavailable.</w:t>
+      </w:r>
+    </w:p>
+    <w:p>
+      <w:pPr>
+        <w:pStyle w:val="Heading1"/>
+      </w:pPr>
+      <w:r>
+        <w:t>38. Revised Success Criteria Additions</w:t>
+      </w:r>
+    </w:p>
+    <w:p>
+      <w:pPr>
+        <w:pStyle w:val="ListBullet"/>
+        <w:spacing w:before="0" w:after="0" w:line="220" w:lineRule="exact"/>
+      </w:pPr>
+      <w:r>
+        <w:rPr>
+          <w:sz w:val="20"/>
+        </w:rPr>
+        <w:t>A Student can submit a housing application with a preferred hall and room style without selecting a specific bed.</w:t>
+      </w:r>
+    </w:p>
+    <w:p>
+      <w:pPr>
+        <w:pStyle w:val="ListBullet"/>
+        <w:spacing w:before="0" w:after="0" w:line="220" w:lineRule="exact"/>
+      </w:pPr>
+      <w:r>
+        <w:rPr>
+          <w:sz w:val="20"/>
+        </w:rPr>
+        <w:t>A Housing Officer can assign an available bed and the database prevents concurrent assignments from claiming the same bed.</w:t>
+      </w:r>
+    </w:p>
+    <w:p>
+      <w:pPr>
+        <w:pStyle w:val="ListBullet"/>
+        <w:spacing w:before="0" w:after="0" w:line="220" w:lineRule="exact"/>
+      </w:pPr>
+      <w:r>
+        <w:rPr>
+          <w:sz w:val="20"/>
+        </w:rPr>
+        <w:t>A Student can request a known roommate and the pair is not established until the other student accepts.</w:t>
+      </w:r>
+    </w:p>
+    <w:p>
+      <w:pPr>
+        <w:pStyle w:val="ListBullet"/>
+        <w:spacing w:before="0" w:after="0" w:line="220" w:lineRule="exact"/>
+      </w:pPr>
+      <w:r>
+        <w:rPr>
+          <w:sz w:val="20"/>
+        </w:rPr>
+        <w:t>An opted-in Student can complete a roommate profile and receive ranked, explainable AI-assisted roommate recommendations.</w:t>
+      </w:r>
+    </w:p>
+    <w:p>
+      <w:pPr>
+        <w:pStyle w:val="ListBullet"/>
+        <w:spacing w:before="0" w:after="0" w:line="220" w:lineRule="exact"/>
+      </w:pPr>
+      <w:r>
+        <w:rPr>
+          <w:sz w:val="20"/>
+        </w:rPr>
+        <w:t>AI recommendations do not automatically create roommate pairs or housing assignments.</w:t>
+      </w:r>
+    </w:p>
+    <w:p>
+      <w:pPr>
+        <w:pStyle w:val="ListBullet"/>
+        <w:spacing w:before="0" w:after="0" w:line="220" w:lineRule="exact"/>
+      </w:pPr>
+      <w:r>
+        <w:rPr>
+          <w:sz w:val="20"/>
+        </w:rPr>
+        <w:t>A Student with an accepted roommate request can proceed through housing assignment and lease completion while preserving the consent/history of the roommate request.</w:t>
       </w:r>
     </w:p>
     <w:sectPr>

</xml_diff>